<commit_message>
fixed wrong usage of gen AI from teammate
</commit_message>
<xml_diff>
--- a/literature_review/literature-review-final-dsa-5.docx
+++ b/literature_review/literature-review-final-dsa-5.docx
@@ -171,26 +171,114 @@
       </w:r>
     </w:p>
     <w:p>
+      <w:pPr>
+        <w:pStyle w:val="Normal"/>
+        <w:suppressLineNumbers w:val="0"/>
+        <w:bidi w:val="0"/>
+        <w:spacing w:before="0" w:beforeAutospacing="off" w:after="160" w:afterAutospacing="off" w:line="279" w:lineRule="auto"/>
+        <w:ind w:left="0" w:right="0"/>
+        <w:jc w:val="left"/>
+      </w:pPr>
       <w:commentRangeStart w:id="1795119156"/>
       <w:r>
         <w:rPr/>
-        <w:t xml:space="preserve">A Convolution Neural Network (CNN) is a special type of neural network designed for the tasks associated with spatial data, such as images. Unlike </w:t>
-      </w:r>
-      <w:r>
-        <w:rPr/>
-        <w:t>traditionally</w:t>
-      </w:r>
-      <w:r>
-        <w:rPr/>
-        <w:t xml:space="preserve"> neural networks where each node, also called neuron, is completely connected to the next layer, using a more effective approach by dividing weight through CNN filters or cores. These filters slip on input data in a process, called kernel, which captures local patterns such as edges, </w:t>
-      </w:r>
-      <w:r>
-        <w:rPr/>
-        <w:t>textures</w:t>
-      </w:r>
-      <w:r>
-        <w:rPr/>
-        <w:t xml:space="preserve"> and shapes. Specific CNN architecture includes several main teams. Conversely, the performance of univariate hybrid CNN models typically improves over later time steps [29,30].  (Tahir, 2024, p. 1) It begins with an input team receiving raw data, followed by affects layers that </w:t>
+        <w:t xml:space="preserve">A Convolution Neural Network (CNN) is a special type of neural network designed for the tasks associated with spatial data, such as images. </w:t>
+      </w:r>
+      <w:r>
+        <w:rPr/>
+        <w:t xml:space="preserve">The concept of </w:t>
+      </w:r>
+      <w:r>
+        <w:rPr/>
+        <w:t xml:space="preserve">neural </w:t>
+      </w:r>
+      <w:r>
+        <w:rPr/>
+        <w:t>networks,</w:t>
+      </w:r>
+      <w:r>
+        <w:rPr/>
+        <w:t xml:space="preserve"> where each node </w:t>
+      </w:r>
+      <w:r>
+        <w:rPr/>
+        <w:t>is called</w:t>
+      </w:r>
+      <w:r>
+        <w:rPr/>
+        <w:t xml:space="preserve"> </w:t>
+      </w:r>
+      <w:r>
+        <w:rPr/>
+        <w:t>a neuron</w:t>
+      </w:r>
+      <w:r>
+        <w:rPr/>
+        <w:t xml:space="preserve"> </w:t>
+      </w:r>
+      <w:r>
+        <w:rPr/>
+        <w:t>and</w:t>
+      </w:r>
+      <w:r>
+        <w:rPr/>
+        <w:t xml:space="preserve"> </w:t>
+      </w:r>
+      <w:r>
+        <w:rPr/>
+        <w:t xml:space="preserve">connected to the next layer, </w:t>
+      </w:r>
+      <w:r>
+        <w:rPr/>
+        <w:t>is that it uses</w:t>
+      </w:r>
+      <w:r>
+        <w:rPr/>
+        <w:t xml:space="preserve"> a more effective approach by dividing weight through CNN filters or cores. These filters slip on input data in a </w:t>
+      </w:r>
+      <w:r>
+        <w:rPr/>
+        <w:t>process</w:t>
+      </w:r>
+      <w:r>
+        <w:rPr/>
+        <w:t xml:space="preserve"> called kernel, which captures local patterns such as edges, </w:t>
+      </w:r>
+      <w:r>
+        <w:rPr/>
+        <w:t>textures,</w:t>
+      </w:r>
+      <w:r>
+        <w:rPr/>
+        <w:t xml:space="preserve"> and shapes. Specific CNN architecture includes several main teams.  </w:t>
+      </w:r>
+      <w:r>
+        <w:rPr/>
+        <w:t>T</w:t>
+      </w:r>
+      <w:r>
+        <w:rPr/>
+        <w:t xml:space="preserve">he performance of </w:t>
+      </w:r>
+      <w:r>
+        <w:rPr/>
+        <w:t>unique</w:t>
+      </w:r>
+      <w:r>
+        <w:rPr/>
+        <w:t xml:space="preserve"> hybrid CNN models typically improves over </w:t>
+      </w:r>
+      <w:r>
+        <w:rPr/>
+        <w:t>later</w:t>
+      </w:r>
+      <w:r>
+        <w:rPr/>
+        <w:t xml:space="preserve"> steps</w:t>
+      </w:r>
+      <w:r>
+        <w:rPr/>
+        <w:t xml:space="preserve">.  (Tahir, 2024, p. 1) It begins with an input team receiving raw data by affects layers that </w:t>
       </w:r>
       <w:r>
         <w:rPr/>
@@ -198,13 +286,89 @@
       </w:r>
       <w:r>
         <w:rPr/>
-        <w:t xml:space="preserve"> the filter to remove the filter. An activation layer, usually using the Relu function, adds non-economically, enables the model to learn complex patterns. The next is the pool layer, which reduces the spatial dimensions of the data, improves calculation efficiency and increases the convenience strength. By stacking many fixed, activation and pool layers, CNN teaches hierarchical functions - from simple to complex structures. This layered approach allows CNN to identify and classify the visual patterns with high accuracy  (Sarafraz I, 2025, p. 1) .Their ability to detect features regardless of sharing the parameters and detecting features makes them very effective for image classification, object detection and other pattern recognition tasks in areas such as health care, safety and autonomous systems. </w:t>
+        <w:t xml:space="preserve"> the filter to remove </w:t>
+      </w:r>
+      <w:r>
+        <w:rPr/>
+        <w:t>it.</w:t>
+      </w:r>
+      <w:r>
+        <w:rPr/>
+        <w:t xml:space="preserve"> A</w:t>
+      </w:r>
+      <w:r>
+        <w:rPr/>
+        <w:t>n activation layer, using the Relu function</w:t>
+      </w:r>
+      <w:r>
+        <w:rPr/>
+        <w:t xml:space="preserve"> </w:t>
+      </w:r>
+      <w:r>
+        <w:rPr/>
+        <w:t>adds non-economically, enables the model to learn complex patterns.</w:t>
+      </w:r>
+      <w:r>
+        <w:rPr/>
+        <w:t xml:space="preserve"> </w:t>
+      </w:r>
+      <w:r>
+        <w:rPr/>
+        <w:t>P</w:t>
+      </w:r>
+      <w:r>
+        <w:rPr/>
+        <w:t xml:space="preserve">ool layer, which reduces </w:t>
+      </w:r>
+      <w:r>
+        <w:rPr/>
+        <w:t>the dimensions</w:t>
+      </w:r>
+      <w:r>
+        <w:rPr/>
+        <w:t xml:space="preserve"> of the data, improves calculation efficiency </w:t>
+      </w:r>
+      <w:r>
+        <w:rPr/>
+        <w:t xml:space="preserve">to </w:t>
+      </w:r>
+      <w:r>
+        <w:rPr/>
+        <w:t>increase</w:t>
+      </w:r>
+      <w:r>
+        <w:rPr/>
+        <w:t xml:space="preserve"> the </w:t>
+      </w:r>
+      <w:r>
+        <w:rPr/>
+        <w:t>convenience of the data</w:t>
+      </w:r>
+      <w:r>
+        <w:rPr/>
+        <w:t xml:space="preserve">. By stacking many fixed, activation and pool layers, CNN teaches hierarchical functions </w:t>
+      </w:r>
+      <w:r>
+        <w:rPr/>
+        <w:t>f</w:t>
+      </w:r>
+      <w:r>
+        <w:rPr/>
+        <w:t xml:space="preserve">rom simple to complex structures. This layered approach allows CNN to identify and classify visual patterns with high accuracy  (Sarafraz I, 2025, p. 1) .Their ability to detect features regardless of sharing parameters and detecting features makes them very effective for image classification, object detection and other pattern recognition tasks in areas such as health care, safety and autonomous systems. </w:t>
       </w:r>
     </w:p>
     <w:p>
       <w:r>
         <w:rPr/>
-        <w:t xml:space="preserve">Edge gadgets inside the Internet of Things (IoT) are essential components that serve as the interface between the physical global and digital networks. These devices </w:t>
+        <w:t xml:space="preserve">Edge gadgets inside the Internet of Things (IoT) are essential components </w:t>
+      </w:r>
+      <w:r>
+        <w:rPr/>
+        <w:t>which</w:t>
+      </w:r>
+      <w:r>
+        <w:rPr/>
+        <w:t xml:space="preserve"> serve as the interface between the physical global and digital networks. These devices </w:t>
       </w:r>
       <w:r>
         <w:rPr/>
@@ -212,7 +376,23 @@
       </w:r>
       <w:r>
         <w:rPr/>
-        <w:t xml:space="preserve">, method, and </w:t>
+        <w:t xml:space="preserve"> </w:t>
+      </w:r>
+      <w:r>
+        <w:rPr/>
+        <w:t>methods</w:t>
+      </w:r>
+      <w:r>
+        <w:rPr/>
+        <w:t xml:space="preserve"> </w:t>
+      </w:r>
+      <w:r>
+        <w:rPr/>
+        <w:t>to</w:t>
+      </w:r>
+      <w:r>
+        <w:rPr/>
+        <w:t xml:space="preserve"> </w:t>
       </w:r>
       <w:r>
         <w:rPr/>
@@ -220,7 +400,23 @@
       </w:r>
       <w:r>
         <w:rPr/>
-        <w:t xml:space="preserve"> statistics from sensors to centralized systems or cloud structures. Common examples consist of microcontrollers like Arduino, that are preferred for his or her low cost, compact length, and power performance. Typically, edge gadgets are designed to be small and battery-powered, making them </w:t>
+        <w:t xml:space="preserve"> statistics from sensors to centralized systems or cloud structures. Common examples consist of microcontrollers like Arduino, that are preferred </w:t>
+      </w:r>
+      <w:r>
+        <w:rPr/>
+        <w:t>for low</w:t>
+      </w:r>
+      <w:r>
+        <w:rPr/>
+        <w:t xml:space="preserve"> cost, compact length</w:t>
+      </w:r>
+      <w:r>
+        <w:rPr/>
+        <w:t>, and power</w:t>
+      </w:r>
+      <w:r>
+        <w:rPr/>
+        <w:t xml:space="preserve"> performance. Typically, edge gadgets are designed to be small and battery-powered, making them </w:t>
       </w:r>
       <w:r>
         <w:rPr/>
@@ -228,11 +424,19 @@
       </w:r>
       <w:r>
         <w:rPr/>
-        <w:t xml:space="preserve"> deployment in far flung or aid-restrained environments. Due to their restrained processing talents, these gadgets often perform preliminary facts processing tasks, which includes filtering or aggregation, earlier than transmitting the information to greater effective structures for similarly analysis. Numerous </w:t>
-      </w:r>
-      <w:r>
-        <w:rPr/>
-        <w:t>organisations</w:t>
+        <w:t xml:space="preserve"> deployment in far flung or aid-restrained environments. Due to their restrained processing talents, these gadgets often perform preliminary facts processing tasks, which includes filtering or aggregation, earlier than transmitting the information to greater effective structures for </w:t>
+      </w:r>
+      <w:r>
+        <w:rPr/>
+        <w:t>similar</w:t>
+      </w:r>
+      <w:r>
+        <w:rPr/>
+        <w:t xml:space="preserve"> analysis. Numerous </w:t>
+      </w:r>
+      <w:r>
+        <w:rPr/>
+        <w:t>organizations</w:t>
       </w:r>
       <w:r>
         <w:rPr/>
@@ -252,23 +456,63 @@
       </w:r>
       <w:r>
         <w:rPr/>
-        <w:t xml:space="preserve"> This technique reduces the quantity of data transmitted, conserves bandwidth, and complements the </w:t>
-      </w:r>
-      <w:r>
-        <w:rPr/>
-        <w:t>general performance</w:t>
-      </w:r>
-      <w:r>
-        <w:rPr/>
-        <w:t xml:space="preserve"> of the IoT system. The integration of area computing into IoT systems permits for real-time statistics processing, which is vital for packages requiring </w:t>
-      </w:r>
-      <w:r>
-        <w:rPr/>
-        <w:t>immediately</w:t>
-      </w:r>
-      <w:r>
-        <w:rPr/>
-        <w:t xml:space="preserve"> responses, together with environmental tracking or commercial automation. Edge devices, networks, communication units, and cloud platforms are all part of the proposed distributed hierarchical data (Malaysia, 2024, p. 4</w:t>
+        <w:t xml:space="preserve"> This technique reduces the quantity of data transmitted, conserves bandwidth</w:t>
+      </w:r>
+      <w:r>
+        <w:rPr/>
+        <w:t>, and complements</w:t>
+      </w:r>
+      <w:r>
+        <w:rPr/>
+        <w:t xml:space="preserve"> </w:t>
+      </w:r>
+      <w:r>
+        <w:rPr/>
+        <w:t xml:space="preserve">the </w:t>
+      </w:r>
+      <w:r>
+        <w:rPr/>
+        <w:t>g</w:t>
+      </w:r>
+      <w:r>
+        <w:rPr/>
+        <w:t>eneral performance</w:t>
+      </w:r>
+      <w:r>
+        <w:rPr/>
+        <w:t xml:space="preserve"> </w:t>
+      </w:r>
+      <w:r>
+        <w:rPr/>
+        <w:t xml:space="preserve">of the IoT system. The integration of area computing into IoT systems </w:t>
+      </w:r>
+      <w:r>
+        <w:rPr/>
+        <w:t>permits</w:t>
+      </w:r>
+      <w:r>
+        <w:rPr/>
+        <w:t xml:space="preserve"> real-time </w:t>
+      </w:r>
+      <w:r>
+        <w:rPr/>
+        <w:t>statistical</w:t>
+      </w:r>
+      <w:r>
+        <w:rPr/>
+        <w:t xml:space="preserve"> processing, which is vital for packages requiring </w:t>
+      </w:r>
+      <w:r>
+        <w:rPr/>
+        <w:t>immediate</w:t>
+      </w:r>
+      <w:r>
+        <w:rPr/>
+        <w:t xml:space="preserve"> </w:t>
+      </w:r>
+      <w:r>
+        <w:rPr/>
+        <w:t>responses, together with environmental tracking or commercial automation. Edge devices, networks, communication units, and cloud platforms are all part of the proposed distributed hierarchical data (Malaysia, 2024, p. 4</w:t>
       </w:r>
       <w:r>
         <w:rPr/>
@@ -282,7 +526,23 @@
     <w:p>
       <w:r>
         <w:rPr/>
-        <w:t xml:space="preserve">As the number of IoT units increases, it becomes important to distribute intelligent treatment functions on direct edge equipment. Traditional deep learning models, especially CNN-based architecture, are known for their high accuracy in vision tasks, but are calculated expensive. This makes them unsuitable for placement on edge equipment, which usually suffers from limited calculation power, memory barriers and strict energy budget.  </w:t>
+        <w:t xml:space="preserve">As the number of IoT units increases, it becomes important to distribute intelligent treatment functions on direct edge equipment. Traditional deep learning models, especially CNN-based architecture, are known for their high accuracy in vision tasks, but are calculated </w:t>
+      </w:r>
+      <w:r>
+        <w:rPr/>
+        <w:t>to be expensive</w:t>
+      </w:r>
+      <w:r>
+        <w:rPr/>
+        <w:t xml:space="preserve">. This makes them unsuitable for placement on edge equipment, which usually suffers from limited calculation power, memory </w:t>
+      </w:r>
+      <w:r>
+        <w:rPr/>
+        <w:t>barriers,</w:t>
+      </w:r>
+      <w:r>
+        <w:rPr/>
+        <w:t xml:space="preserve"> and strict energy budget.  </w:t>
       </w:r>
       <w:r>
         <w:rPr/>
@@ -294,11 +554,19 @@
       </w:r>
       <w:r>
         <w:rPr/>
-        <w:t xml:space="preserve">, a light vision transformer that integrates CNN components to enable effective and correct visual processing on edge platforms. IoT devices can guess real time without relying on cloud-based calculations, one of the main benefits of entering such customized CNN-based models. It reduces the delay, increases </w:t>
-      </w:r>
-      <w:r>
-        <w:rPr/>
-        <w:t>privacy</w:t>
+        <w:t xml:space="preserve">, a light vision transformer that integrates CNN components to enable effective and correct visual processing on edge platforms. IoT devices can guess real time without relying on cloud-based calculations, one of the main benefits of entering such customized CNN-based models. It </w:t>
+      </w:r>
+      <w:r>
+        <w:rPr/>
+        <w:t>reduces delays</w:t>
+      </w:r>
+      <w:r>
+        <w:rPr/>
+        <w:t xml:space="preserve">, increases </w:t>
+      </w:r>
+      <w:r>
+        <w:rPr/>
+        <w:t>privacy,</w:t>
       </w:r>
       <w:r>
         <w:rPr/>
@@ -314,15 +582,15 @@
       </w:r>
       <w:r>
         <w:rPr/>
-        <w:t xml:space="preserve"> also enable local decisions. For applications such as industrial monitoring, </w:t>
-      </w:r>
-      <w:r>
-        <w:rPr/>
-        <w:t>monitoring</w:t>
-      </w:r>
-      <w:r>
-        <w:rPr/>
-        <w:t xml:space="preserve"> and environmental sensations, it is important for responsibility for real time. In addition, the paper shows that </w:t>
+        <w:t xml:space="preserve"> also enable local decisions. For applications such as industrial monitoring</w:t>
+      </w:r>
+      <w:r>
+        <w:rPr/>
+        <w:t xml:space="preserve"> </w:t>
+      </w:r>
+      <w:r>
+        <w:rPr/>
+        <w:t xml:space="preserve">and environmental sensations, it is important for responsibility for real time. In addition, paper shows that </w:t>
       </w:r>
       <w:r>
         <w:rPr/>
@@ -350,11 +618,27 @@
       </w:r>
       <w:r>
         <w:rPr/>
-        <w:t xml:space="preserve"> stages, the model balances the model accuracy and the calculation load using techniques such as ESHA (ESHA) and depth of convention layers. This covered approach allows CNN opportunities to be used effectively in inaccessible scenarios due to resource constraints. The result is </w:t>
-      </w:r>
-      <w:r>
-        <w:rPr/>
-        <w:t>a scalable</w:t>
+        <w:t xml:space="preserve"> stages, the model balances the </w:t>
+      </w:r>
+      <w:r>
+        <w:rPr/>
+        <w:t>model's</w:t>
+      </w:r>
+      <w:r>
+        <w:rPr/>
+        <w:t xml:space="preserve"> accuracy and the calculation load using techniques such </w:t>
+      </w:r>
+      <w:r>
+        <w:rPr/>
+        <w:t>as (</w:t>
+      </w:r>
+      <w:r>
+        <w:rPr/>
+        <w:t xml:space="preserve">ESHA) and depth of convention layers. This covered approach allows CNN opportunities to be used effectively in inaccessible scenarios due to resource constraints. The result is </w:t>
+      </w:r>
+      <w:r>
+        <w:rPr/>
+        <w:t>scalable</w:t>
       </w:r>
       <w:r>
         <w:rPr/>
@@ -366,7 +650,7 @@
       </w:r>
       <w:r>
         <w:rPr/>
-        <w:t>effective</w:t>
+        <w:t>effective,</w:t>
       </w:r>
       <w:r>
         <w:rPr/>
@@ -374,7 +658,7 @@
       </w:r>
       <w:r>
         <w:rPr/>
-        <w:t>power</w:t>
+        <w:t>powerful</w:t>
       </w:r>
       <w:r>
         <w:rPr/>

</xml_diff>